<commit_message>
DOCS : 24-04-2026, HTML/CSS - Flexbox
</commit_message>
<xml_diff>
--- a/HTML_CSS/HTML_CSS_Cours_1.docx
+++ b/HTML_CSS/HTML_CSS_Cours_1.docx
@@ -4,7 +4,15 @@
   <w:body>
     <w:p>
       <w:r>
-        <w:t>Faire nos tests sur Chrome (pour avoir un navigateur avec un noyau Chromium) et Firefox, en gros tester plusieurs navigateurs pour vérifier que ça marche</w:t>
+        <w:t xml:space="preserve">Faire nos tests sur Chrome (pour avoir un navigateur avec un noyau </w:t>
+      </w:r>
+      <w:proofErr w:type="spellStart"/>
+      <w:r>
+        <w:t>Chromium</w:t>
+      </w:r>
+      <w:proofErr w:type="spellEnd"/>
+      <w:r>
+        <w:t>) et Firefox, en gros tester plusieurs navigateurs pour vérifier que ça marche</w:t>
       </w:r>
     </w:p>
     <w:p>
@@ -26,7 +34,15 @@
     <w:p/>
     <w:p>
       <w:r>
-        <w:t>On utilise &lt;br&gt; UNIQUEMENT dans du texte</w:t>
+        <w:t>On utilise &lt;</w:t>
+      </w:r>
+      <w:proofErr w:type="spellStart"/>
+      <w:r>
+        <w:t>br</w:t>
+      </w:r>
+      <w:proofErr w:type="spellEnd"/>
+      <w:r>
+        <w:t>&gt; UNIQUEMENT dans du texte</w:t>
       </w:r>
     </w:p>
     <w:p>
@@ -65,7 +81,22 @@
     <w:p>
       <w:r>
         <w:tab/>
-        <w:t>Inline : Pas de retour à la ligne, se trouve automatiquement à l’intérieur d’une balise block et peut contenir du texte ou des balises inline uniquement</w:t>
+      </w:r>
+      <w:proofErr w:type="spellStart"/>
+      <w:r>
+        <w:t>Inline</w:t>
+      </w:r>
+      <w:proofErr w:type="spellEnd"/>
+      <w:r>
+        <w:t xml:space="preserve"> : Pas de retour à la ligne, se trouve automatiquement à l’intérieur d’une balise block et peut contenir du texte ou des balises </w:t>
+      </w:r>
+      <w:proofErr w:type="spellStart"/>
+      <w:r>
+        <w:t>inline</w:t>
+      </w:r>
+      <w:proofErr w:type="spellEnd"/>
+      <w:r>
+        <w:t xml:space="preserve"> uniquement</w:t>
       </w:r>
     </w:p>
     <w:p/>
@@ -80,13 +111,37 @@
     <w:p/>
     <w:p>
       <w:r>
-        <w:t>Si on veut écrire 2 &lt;p&gt; à la suite, généralement on met un &lt;br&gt; à l’intérieur d’un même paragraphe (sauf si il y a besoin de les identifier)</w:t>
-      </w:r>
-    </w:p>
-    <w:p/>
-    <w:p>
-      <w:r>
-        <w:t>Si on doit mettre 2 &lt;br&gt; à la suite dans un paragraphe, on le fait en CSS</w:t>
+        <w:t>Si on veut écrire 2 &lt;p&gt; à la suite, généralement on met un &lt;</w:t>
+      </w:r>
+      <w:proofErr w:type="spellStart"/>
+      <w:r>
+        <w:t>br</w:t>
+      </w:r>
+      <w:proofErr w:type="spellEnd"/>
+      <w:r>
+        <w:t xml:space="preserve">&gt; à l’intérieur d’un même paragraphe (sauf </w:t>
+      </w:r>
+      <w:proofErr w:type="gramStart"/>
+      <w:r>
+        <w:t>si il</w:t>
+      </w:r>
+      <w:proofErr w:type="gramEnd"/>
+      <w:r>
+        <w:t xml:space="preserve"> y a besoin de les identifier)</w:t>
+      </w:r>
+    </w:p>
+    <w:p/>
+    <w:p>
+      <w:r>
+        <w:t>Si on doit mettre 2 &lt;</w:t>
+      </w:r>
+      <w:proofErr w:type="spellStart"/>
+      <w:r>
+        <w:t>br</w:t>
+      </w:r>
+      <w:proofErr w:type="spellEnd"/>
+      <w:r>
+        <w:t>&gt; à la suite dans un paragraphe, on le fait en CSS</w:t>
       </w:r>
     </w:p>
     <w:p/>
@@ -98,7 +153,23 @@
     <w:p/>
     <w:p>
       <w:r>
-        <w:t>Ne pas utiliser les balises em, strong, etc.</w:t>
+        <w:t xml:space="preserve">Ne pas utiliser les balises </w:t>
+      </w:r>
+      <w:proofErr w:type="spellStart"/>
+      <w:r>
+        <w:t>em</w:t>
+      </w:r>
+      <w:proofErr w:type="spellEnd"/>
+      <w:r>
+        <w:t xml:space="preserve">, </w:t>
+      </w:r>
+      <w:proofErr w:type="spellStart"/>
+      <w:r>
+        <w:t>strong</w:t>
+      </w:r>
+      <w:proofErr w:type="spellEnd"/>
+      <w:r>
+        <w:t>, etc.</w:t>
       </w:r>
       <w:r>
         <w:t xml:space="preserve"> pour un paragraphe entier par exemple</w:t>
@@ -107,9 +178,19 @@
     <w:p/>
     <w:p/>
     <w:p>
-      <w:r>
-        <w:t>a attribut : title</w:t>
-      </w:r>
+      <w:proofErr w:type="gramStart"/>
+      <w:r>
+        <w:t>a</w:t>
+      </w:r>
+      <w:proofErr w:type="gramEnd"/>
+      <w:r>
+        <w:t xml:space="preserve"> attribut : </w:t>
+      </w:r>
+      <w:proofErr w:type="spellStart"/>
+      <w:r>
+        <w:t>title</w:t>
+      </w:r>
+      <w:proofErr w:type="spellEnd"/>
     </w:p>
     <w:p>
       <w:r>
@@ -117,7 +198,24 @@
       </w:r>
       <w:r>
         <w:tab/>
-        <w:t>target = « _blank » : ouvre dans un onglet</w:t>
+      </w:r>
+      <w:proofErr w:type="spellStart"/>
+      <w:proofErr w:type="gramStart"/>
+      <w:r>
+        <w:t>target</w:t>
+      </w:r>
+      <w:proofErr w:type="spellEnd"/>
+      <w:proofErr w:type="gramEnd"/>
+      <w:r>
+        <w:t xml:space="preserve"> = « _</w:t>
+      </w:r>
+      <w:proofErr w:type="spellStart"/>
+      <w:r>
+        <w:t>blank</w:t>
+      </w:r>
+      <w:proofErr w:type="spellEnd"/>
+      <w:r>
+        <w:t> » : ouvre dans un onglet</w:t>
       </w:r>
     </w:p>
     <w:p>
@@ -127,8 +225,13 @@
       </w:r>
     </w:p>
     <w:p>
-      <w:r>
-        <w:t xml:space="preserve">le « ./ » est important, même pour le même dossier ! L’ordinateur peut être perdu si on transfère le dossier sans ça </w:t>
+      <w:proofErr w:type="gramStart"/>
+      <w:r>
+        <w:t>le</w:t>
+      </w:r>
+      <w:proofErr w:type="gramEnd"/>
+      <w:r>
+        <w:t xml:space="preserve"> « ./ » est important, même pour le même dossier ! L’ordinateur peut être perdu si on transfère le dossier sans ça </w:t>
       </w:r>
     </w:p>
     <w:p/>
@@ -145,7 +248,15 @@
     </w:p>
     <w:p>
       <w:r>
-        <w:t>Le webp donne un meilleur référencement pour Google</w:t>
+        <w:t xml:space="preserve">Le </w:t>
+      </w:r>
+      <w:proofErr w:type="spellStart"/>
+      <w:r>
+        <w:t>webp</w:t>
+      </w:r>
+      <w:proofErr w:type="spellEnd"/>
+      <w:r>
+        <w:t xml:space="preserve"> donne un meilleur référencement pour Google</w:t>
       </w:r>
       <w:r>
         <w:t>*</w:t>
@@ -239,13 +350,34 @@
     </w:p>
     <w:p>
       <w:r>
-        <w:t>L’attribut alt DOIT être utiliser pour les balises &lt;img&gt;</w:t>
-      </w:r>
-    </w:p>
-    <w:p>
-      <w:r>
-        <w:t>Penser à l’audio-description</w:t>
-      </w:r>
+        <w:t xml:space="preserve">L’attribut </w:t>
+      </w:r>
+      <w:proofErr w:type="spellStart"/>
+      <w:r>
+        <w:t>alt</w:t>
+      </w:r>
+      <w:proofErr w:type="spellEnd"/>
+      <w:r>
+        <w:t xml:space="preserve"> DOIT être utiliser pour les balises &lt;</w:t>
+      </w:r>
+      <w:proofErr w:type="spellStart"/>
+      <w:r>
+        <w:t>img</w:t>
+      </w:r>
+      <w:proofErr w:type="spellEnd"/>
+      <w:r>
+        <w:t>&gt;</w:t>
+      </w:r>
+    </w:p>
+    <w:p>
+      <w:r>
+        <w:t>Penser à l’</w:t>
+      </w:r>
+      <w:proofErr w:type="spellStart"/>
+      <w:r>
+        <w:t>audio-description</w:t>
+      </w:r>
+      <w:proofErr w:type="spellEnd"/>
     </w:p>
     <w:p>
       <w:r>
@@ -448,7 +580,23 @@
     </w:p>
     <w:p>
       <w:r>
-        <w:t>Aria-hidden : empêcher le lecteur d’écran de lire une émoji par exemple</w:t>
+        <w:t>Aria-</w:t>
+      </w:r>
+      <w:proofErr w:type="spellStart"/>
+      <w:r>
+        <w:t>hidden</w:t>
+      </w:r>
+      <w:proofErr w:type="spellEnd"/>
+      <w:r>
+        <w:t xml:space="preserve"> : empêcher le lecteur d’écran de lire une </w:t>
+      </w:r>
+      <w:proofErr w:type="spellStart"/>
+      <w:r>
+        <w:t>émoji</w:t>
+      </w:r>
+      <w:proofErr w:type="spellEnd"/>
+      <w:r>
+        <w:t xml:space="preserve"> par exemple</w:t>
       </w:r>
     </w:p>
     <w:p/>
@@ -515,7 +663,15 @@
     </w:p>
     <w:p>
       <w:r>
-        <w:t>Le alt vide ça reste pas ouf même si ça peut se faire</w:t>
+        <w:t xml:space="preserve">Le </w:t>
+      </w:r>
+      <w:proofErr w:type="spellStart"/>
+      <w:r>
+        <w:t>alt</w:t>
+      </w:r>
+      <w:proofErr w:type="spellEnd"/>
+      <w:r>
+        <w:t xml:space="preserve"> vide ça reste pas ouf même si ça peut se faire</w:t>
       </w:r>
     </w:p>
     <w:p/>
@@ -548,13 +704,159 @@
     <w:p/>
     <w:p>
       <w:r>
-        <w:t>On peut utiliser des pixels pour les choses très précises comme les box-shadows</w:t>
-      </w:r>
-    </w:p>
-    <w:p>
+        <w:t>On peut utiliser des pixels pour les choses très précises comme les box-</w:t>
+      </w:r>
+      <w:proofErr w:type="spellStart"/>
+      <w:r>
+        <w:t>shadows</w:t>
+      </w:r>
+      <w:proofErr w:type="spellEnd"/>
+    </w:p>
+    <w:p/>
+    <w:p/>
+    <w:p>
+      <w:pPr>
+        <w:jc w:val="center"/>
+        <w:rPr>
+          <w:b/>
+          <w:sz w:val="28"/>
+        </w:rPr>
+      </w:pPr>
+      <w:r>
+        <w:rPr>
+          <w:b/>
+          <w:sz w:val="28"/>
+        </w:rPr>
+        <w:t>LES TABLEAUX</w:t>
+      </w:r>
+    </w:p>
+    <w:p>
+      <w:pPr>
+        <w:jc w:val="center"/>
+        <w:rPr>
+          <w:b/>
+          <w:sz w:val="28"/>
+        </w:rPr>
+      </w:pPr>
+    </w:p>
+    <w:p>
+      <w:r>
+        <w:t xml:space="preserve">Utiliser </w:t>
+      </w:r>
+      <w:proofErr w:type="spellStart"/>
+      <w:r>
+        <w:t>thead</w:t>
+      </w:r>
+      <w:proofErr w:type="spellEnd"/>
+      <w:r>
+        <w:t xml:space="preserve">, </w:t>
+      </w:r>
+      <w:proofErr w:type="spellStart"/>
+      <w:r>
+        <w:t>tbody</w:t>
+      </w:r>
+      <w:proofErr w:type="spellEnd"/>
+      <w:r>
+        <w:t xml:space="preserve"> et </w:t>
+      </w:r>
+      <w:proofErr w:type="spellStart"/>
+      <w:r>
+        <w:t>tfoot</w:t>
+      </w:r>
+      <w:proofErr w:type="spellEnd"/>
+      <w:r>
+        <w:t xml:space="preserve"> est utile aussi pour l’accessibilité car le lecteur d’écran va le lire</w:t>
+      </w:r>
+    </w:p>
+    <w:p>
+      <w:proofErr w:type="gramStart"/>
+      <w:r>
+        <w:t>td</w:t>
+      </w:r>
+      <w:proofErr w:type="gramEnd"/>
+      <w:r>
+        <w:t xml:space="preserve"> </w:t>
+      </w:r>
+      <w:proofErr w:type="spellStart"/>
+      <w:r>
+        <w:t>rowspan</w:t>
+      </w:r>
+      <w:proofErr w:type="spellEnd"/>
+      <w:r>
+        <w:t xml:space="preserve"> = «2 » pour que la ligne prenne la place de deux places</w:t>
+      </w:r>
+    </w:p>
+    <w:p>
+      <w:proofErr w:type="gramStart"/>
+      <w:r>
+        <w:t>td</w:t>
+      </w:r>
+      <w:proofErr w:type="gramEnd"/>
+      <w:r>
+        <w:t xml:space="preserve"> </w:t>
+      </w:r>
+      <w:proofErr w:type="spellStart"/>
+      <w:r>
+        <w:t>colspan</w:t>
+      </w:r>
+      <w:proofErr w:type="spellEnd"/>
+      <w:r>
+        <w:t xml:space="preserve"> = « 2 » prend la place de deux colonnes</w:t>
+      </w:r>
+    </w:p>
+    <w:p/>
+    <w:p/>
+    <w:p/>
+    <w:p>
+      <w:r>
+        <w:t>LES FORMULAIRES</w:t>
+      </w:r>
+    </w:p>
+    <w:p/>
+    <w:p>
+      <w:proofErr w:type="gramStart"/>
+      <w:r>
+        <w:t>le</w:t>
+      </w:r>
+      <w:proofErr w:type="gramEnd"/>
+      <w:r>
+        <w:t xml:space="preserve"> type pour input sert beaucoup sur mobile car il change le clavier qui est </w:t>
+      </w:r>
+      <w:proofErr w:type="spellStart"/>
+      <w:r>
+        <w:t>sortit</w:t>
+      </w:r>
+      <w:proofErr w:type="spellEnd"/>
+      <w:r>
+        <w:t xml:space="preserve"> par le téléphone, par exemple pour type = « tel », c’est le clavier de numéros qui sortira</w:t>
+      </w:r>
+    </w:p>
+    <w:p>
+      <w:proofErr w:type="gramStart"/>
+      <w:r>
+        <w:t>type</w:t>
+      </w:r>
+      <w:proofErr w:type="gramEnd"/>
+      <w:r>
+        <w:t xml:space="preserve"> : </w:t>
+      </w:r>
+      <w:proofErr w:type="spellStart"/>
+      <w:r>
+        <w:t>number</w:t>
+      </w:r>
+      <w:proofErr w:type="spellEnd"/>
+      <w:r>
+        <w:t xml:space="preserve"> met des petites flèches pour augmenter, baisser de base</w:t>
+      </w:r>
       <w:bookmarkStart w:id="0" w:name="_GoBack"/>
       <w:bookmarkEnd w:id="0"/>
     </w:p>
+    <w:p/>
+    <w:p/>
+    <w:p/>
+    <w:p/>
+    <w:p/>
+    <w:p/>
     <w:sectPr>
       <w:pgSz w:w="11906" w:h="16838"/>
       <w:pgMar w:top="1417" w:right="1417" w:bottom="1417" w:left="1417" w:header="708" w:footer="708" w:gutter="0"/>

</xml_diff>